<commit_message>
fix: Se agrega el enlace del repositorio en el informe
</commit_message>
<xml_diff>
--- a/reports/EC3-PC.docx
+++ b/reports/EC3-PC.docx
@@ -25,12 +25,12 @@
             <wp:extent cx="1200150" cy="1200150"/>
             <wp:effectExtent b="0" l="0" r="0" t="0"/>
             <wp:wrapNone/>
-            <wp:docPr descr="Guía de Normas Gráficas Corporativas « Universidad Católica del Norte" id="2" name="image1.png"/>
+            <wp:docPr descr="Guía de Normas Gráficas Corporativas « Universidad Católica del Norte" id="2" name="image5.png"/>
             <a:graphic>
               <a:graphicData uri="http://schemas.openxmlformats.org/drawingml/2006/picture">
                 <pic:pic>
                   <pic:nvPicPr>
-                    <pic:cNvPr descr="Guía de Normas Gráficas Corporativas « Universidad Católica del Norte" id="0" name="image1.png"/>
+                    <pic:cNvPr descr="Guía de Normas Gráficas Corporativas « Universidad Católica del Norte" id="0" name="image5.png"/>
                     <pic:cNvPicPr preferRelativeResize="0"/>
                   </pic:nvPicPr>
                   <pic:blipFill>
@@ -506,7 +506,7 @@
     </w:p>
     <w:sdt>
       <w:sdtPr>
-        <w:id w:val="295029312"/>
+        <w:id w:val="-2067469964"/>
         <w:docPartObj>
           <w:docPartGallery w:val="Table of Contents"/>
           <w:docPartUnique w:val="1"/>
@@ -5172,12 +5172,12 @@
             <wp:extent cx="6423666" cy="3448050"/>
             <wp:effectExtent b="0" l="0" r="0" t="0"/>
             <wp:wrapNone/>
-            <wp:docPr id="3" name="image5.png"/>
+            <wp:docPr id="3" name="image6.png"/>
             <a:graphic>
               <a:graphicData uri="http://schemas.openxmlformats.org/drawingml/2006/picture">
                 <pic:pic>
                   <pic:nvPicPr>
-                    <pic:cNvPr id="0" name="image5.png"/>
+                    <pic:cNvPr id="0" name="image6.png"/>
                     <pic:cNvPicPr preferRelativeResize="0"/>
                   </pic:nvPicPr>
                   <pic:blipFill>
@@ -5536,12 +5536,12 @@
           <wp:inline distB="0" distT="0" distL="0" distR="0">
             <wp:extent cx="5612130" cy="3532505"/>
             <wp:effectExtent b="0" l="0" r="0" t="0"/>
-            <wp:docPr id="4" name="image3.png"/>
+            <wp:docPr id="4" name="image2.png"/>
             <a:graphic>
               <a:graphicData uri="http://schemas.openxmlformats.org/drawingml/2006/picture">
                 <pic:pic>
                   <pic:nvPicPr>
-                    <pic:cNvPr id="0" name="image3.png"/>
+                    <pic:cNvPr id="0" name="image2.png"/>
                     <pic:cNvPicPr preferRelativeResize="0"/>
                   </pic:nvPicPr>
                   <pic:blipFill>
@@ -5641,12 +5641,12 @@
           <wp:inline distB="0" distT="0" distL="0" distR="0">
             <wp:extent cx="4381500" cy="2238375"/>
             <wp:effectExtent b="0" l="0" r="0" t="0"/>
-            <wp:docPr id="6" name="image2.png"/>
+            <wp:docPr id="6" name="image3.png"/>
             <a:graphic>
               <a:graphicData uri="http://schemas.openxmlformats.org/drawingml/2006/picture">
                 <pic:pic>
                   <pic:nvPicPr>
-                    <pic:cNvPr id="0" name="image2.png"/>
+                    <pic:cNvPr id="0" name="image3.png"/>
                     <pic:cNvPicPr preferRelativeResize="0"/>
                   </pic:nvPicPr>
                   <pic:blipFill>
@@ -5733,12 +5733,12 @@
           <wp:inline distB="0" distT="0" distL="0" distR="0">
             <wp:extent cx="5566206" cy="1536757"/>
             <wp:effectExtent b="0" l="0" r="0" t="0"/>
-            <wp:docPr id="5" name="image4.png"/>
+            <wp:docPr id="5" name="image1.png"/>
             <a:graphic>
               <a:graphicData uri="http://schemas.openxmlformats.org/drawingml/2006/picture">
                 <pic:pic>
                   <pic:nvPicPr>
-                    <pic:cNvPr id="0" name="image4.png"/>
+                    <pic:cNvPr id="0" name="image1.png"/>
                     <pic:cNvPicPr preferRelativeResize="0"/>
                   </pic:nvPicPr>
                   <pic:blipFill>
@@ -5829,12 +5829,12 @@
           <wp:inline distB="0" distT="0" distL="0" distR="0">
             <wp:extent cx="4601217" cy="352474"/>
             <wp:effectExtent b="0" l="0" r="0" t="0"/>
-            <wp:docPr id="1" name="image6.png"/>
+            <wp:docPr id="1" name="image4.png"/>
             <a:graphic>
               <a:graphicData uri="http://schemas.openxmlformats.org/drawingml/2006/picture">
                 <pic:pic>
                   <pic:nvPicPr>
-                    <pic:cNvPr id="0" name="image6.png"/>
+                    <pic:cNvPr id="0" name="image4.png"/>
                     <pic:cNvPicPr preferRelativeResize="0"/>
                   </pic:nvPicPr>
                   <pic:blipFill>
@@ -8363,11 +8363,11 @@
       <w:hyperlink r:id="rId14">
         <w:r>
           <w:rPr>
-            <w:color w:val="467886"/>
+            <w:color w:val="1155cc"/>
             <w:u w:val="single"/>
             <w:rtl w:val="0"/>
           </w:rPr>
-          <w:t xml:space="preserve">https://github.com/VicenteCZ0/EC1.git</w:t>
+          <w:t xml:space="preserve">https://github.com/MayckolO/Trabajo3_PC</w:t>
         </w:r>
       </w:hyperlink>
       <w:r>

</xml_diff>